<commit_message>
-unfinished testing tailscale network MOB004
</commit_message>
<xml_diff>
--- a/banking-lab/docs/00_Draft/BL-MOB-002_Flutter_Mobile_Architecture_and_UI_Engineering_Guide_v1.0.docx
+++ b/banking-lab/docs/00_Draft/BL-MOB-002_Flutter_Mobile_Architecture_and_UI_Engineering_Guide_v1.0.docx
@@ -6,24 +6,17 @@
       <w:pPr>
         <w:spacing w:before="520" w:lineRule="auto"/>
         <w:jc w:val="center"/>
-        <w:rPr/>
       </w:pPr>
       <w:r>
         <w:rPr>
-          <w:rFonts w:ascii="Play" w:cs="Play" w:eastAsia="Play" w:hAnsi="Play"/>
-          <w:b w:val="1"/>
-          <w:bCs w:val="1"/>
+          <w:rFonts w:ascii="Play" w:hAnsi="Play" w:eastAsia="Play" w:cs="Play"/>
+          <w:b/>
+          <w:bCs/>
           <w:color w:val="2f5d8a"/>
           <w:sz w:val="28"/>
           <w:szCs w:val="28"/>
-          <w:rtl w:val="0"/>
         </w:rPr>
-        <w:t xml:space="preserve">BANKING LAB</w:t>
-      </w:r>
-      <w:r>
-        <w:rPr>
-          <w:rtl w:val="0"/>
-        </w:rPr>
+        <w:t>flutterBANKING LAB</w:t>
       </w:r>
     </w:p>
     <w:p>
@@ -9135,30 +9128,30 @@
 </file>
 
 <file path=word/footer1.xml><?xml version="1.0" encoding="utf-8"?>
-<w:ftr xmlns:mc="http://schemas.openxmlformats.org/markup-compatibility/2006" xmlns:o="urn:schemas-microsoft-com:office:office" xmlns:r="http://schemas.openxmlformats.org/officeDocument/2006/relationships" xmlns:m="http://schemas.openxmlformats.org/officeDocument/2006/math" xmlns:v="urn:schemas-microsoft-com:vml" xmlns:wp="http://schemas.openxmlformats.org/drawingml/2006/wordprocessingDrawing" xmlns:w10="urn:schemas-microsoft-com:office:word" xmlns:w="http://schemas.openxmlformats.org/wordprocessingml/2006/main" xmlns:wne="http://schemas.microsoft.com/office/word/2006/wordml" xmlns:sl="http://schemas.openxmlformats.org/schemaLibrary/2006/main" xmlns:a="http://schemas.openxmlformats.org/drawingml/2006/main" xmlns:pic="http://schemas.openxmlformats.org/drawingml/2006/picture" xmlns:c="http://schemas.openxmlformats.org/drawingml/2006/chart" xmlns:lc="http://schemas.openxmlformats.org/drawingml/2006/lockedCanvas" xmlns:dgm="http://schemas.openxmlformats.org/drawingml/2006/diagram" xmlns:wps="http://schemas.microsoft.com/office/word/2010/wordprocessingShape" xmlns:wpg="http://schemas.microsoft.com/office/word/2010/wordprocessingGroup" xmlns:w14="http://schemas.microsoft.com/office/word/2010/wordml" xmlns:w15="http://schemas.microsoft.com/office/word/2012/wordml" xmlns:w16="http://schemas.microsoft.com/office/word/2018/wordml" xmlns:w16cex="http://schemas.microsoft.com/office/word/2018/wordml/cex" xmlns:w16cid="http://schemas.microsoft.com/office/word/2016/wordml/cid" xmlns="http://schemas.microsoft.com/office/tasks/2019/documenttasks" xmlns:cr="http://schemas.microsoft.com/office/comments/2020/reactions">
+<w:ftr xmlns:wpc="http://schemas.microsoft.com/office/word/2010/wordprocessingCanvas" xmlns:mc="http://schemas.openxmlformats.org/markup-compatibility/2006" xmlns:o="urn:schemas-microsoft-com:office:office" xmlns:r="http://schemas.openxmlformats.org/officeDocument/2006/relationships" xmlns:m="http://schemas.openxmlformats.org/officeDocument/2006/math" xmlns:v="urn:schemas-microsoft-com:vml" xmlns:wp14="http://schemas.microsoft.com/office/word/2010/wordprocessingDrawing" xmlns:wp="http://schemas.openxmlformats.org/drawingml/2006/wordprocessingDrawing" xmlns:w10="urn:schemas-microsoft-com:office:word" xmlns:w="http://schemas.openxmlformats.org/wordprocessingml/2006/main" xmlns:w14="http://schemas.microsoft.com/office/word/2010/wordml" xmlns:w15="http://schemas.microsoft.com/office/word/2012/wordml" xmlns:w16se="http://schemas.microsoft.com/office/word/2015/wordml/symex" xmlns:w16cid="http://schemas.microsoft.com/office/word/2016/wordml/cid" xmlns:w16="http://schemas.microsoft.com/office/word/2018/wordml" xmlns:w16cex="http://schemas.microsoft.com/office/word/2018/wordml/cex" xmlns:w16sdtdh="http://schemas.microsoft.com/office/word/2020/wordml/sdtdatahash" xmlns:wne="http://schemas.microsoft.com/office/word/2006/wordml" xmlns:wpg="http://schemas.microsoft.com/office/word/2010/wordprocessingGroup" xmlns:wps="http://schemas.microsoft.com/office/word/2010/wordprocessingShape">
   <w:p>
     <w:pPr>
       <w:keepNext w:val="0"/>
       <w:keepLines w:val="0"/>
       <w:pageBreakBefore w:val="0"/>
-      <w:widowControl w:val="1"/>
+      <w:widowControl/>
       <w:pBdr>
-        <w:top w:space="0" w:sz="0" w:val="nil"/>
-        <w:left w:space="0" w:sz="0" w:val="nil"/>
-        <w:bottom w:space="0" w:sz="0" w:val="nil"/>
-        <w:right w:space="0" w:sz="0" w:val="nil"/>
-        <w:between w:space="0" w:sz="0" w:val="nil"/>
+        <w:top w:val="nil"/>
+        <w:left w:val="nil"/>
+        <w:bottom w:val="nil"/>
+        <w:right w:val="nil"/>
+        <w:between w:val="nil"/>
       </w:pBdr>
-      <w:shd w:fill="auto" w:val="clear"/>
+      <w:shd w:val="clear"/>
       <w:tabs>
-        <w:tab w:val="center" w:leader="none" w:pos="4680"/>
-        <w:tab w:val="right" w:leader="none" w:pos="9360"/>
+        <w:tab w:val="center" w:pos="4680"/>
+        <w:tab w:val="right" w:pos="9360"/>
       </w:tabs>
-      <w:spacing w:after="0" w:before="0" w:line="240" w:lineRule="auto"/>
-      <w:ind w:left="0" w:right="0" w:firstLine="0"/>
+      <w:spacing w:before="0" w:after="0" w:line="240" w:lineRule="auto"/>
+      <w:ind w:left="0" w:right="0"/>
       <w:jc w:val="center"/>
       <w:rPr>
-        <w:rFonts w:ascii="Aptos" w:cs="Aptos" w:eastAsia="Aptos" w:hAnsi="Aptos"/>
+        <w:rFonts w:ascii="Aptos" w:hAnsi="Aptos" w:eastAsia="Aptos" w:cs="Aptos"/>
         <w:b w:val="0"/>
         <w:bCs w:val="0"/>
         <w:i w:val="0"/>
@@ -9169,13 +9162,12 @@
         <w:sz w:val="18"/>
         <w:szCs w:val="18"/>
         <w:u w:val="none"/>
-        <w:shd w:fill="auto" w:val="clear"/>
-        <w:vertAlign w:val="baseline"/>
+        <w:shd w:val="clear"/>
       </w:rPr>
     </w:pPr>
     <w:r>
       <w:rPr>
-        <w:rFonts w:ascii="Aptos" w:cs="Aptos" w:eastAsia="Aptos" w:hAnsi="Aptos"/>
+        <w:rFonts w:ascii="Aptos" w:hAnsi="Aptos" w:eastAsia="Aptos" w:cs="Aptos"/>
         <w:b w:val="0"/>
         <w:bCs w:val="0"/>
         <w:i w:val="0"/>
@@ -9186,8 +9178,7 @@
         <w:sz w:val="15"/>
         <w:szCs w:val="15"/>
         <w:u w:val="none"/>
-        <w:shd w:fill="auto" w:val="clear"/>
-        <w:vertAlign w:val="baseline"/>
+        <w:shd w:val="clear"/>
         <w:rtl w:val="0"/>
       </w:rPr>
       <w:t xml:space="preserve">BL-MOB-002  |  Version 1.0  |  Internal Educational Project</w:t>
@@ -9202,30 +9193,30 @@
 </file>
 
 <file path=word/header1.xml><?xml version="1.0" encoding="utf-8"?>
-<w:hdr xmlns:mc="http://schemas.openxmlformats.org/markup-compatibility/2006" xmlns:o="urn:schemas-microsoft-com:office:office" xmlns:r="http://schemas.openxmlformats.org/officeDocument/2006/relationships" xmlns:m="http://schemas.openxmlformats.org/officeDocument/2006/math" xmlns:v="urn:schemas-microsoft-com:vml" xmlns:wp="http://schemas.openxmlformats.org/drawingml/2006/wordprocessingDrawing" xmlns:w10="urn:schemas-microsoft-com:office:word" xmlns:w="http://schemas.openxmlformats.org/wordprocessingml/2006/main" xmlns:wne="http://schemas.microsoft.com/office/word/2006/wordml" xmlns:sl="http://schemas.openxmlformats.org/schemaLibrary/2006/main" xmlns:a="http://schemas.openxmlformats.org/drawingml/2006/main" xmlns:pic="http://schemas.openxmlformats.org/drawingml/2006/picture" xmlns:c="http://schemas.openxmlformats.org/drawingml/2006/chart" xmlns:lc="http://schemas.openxmlformats.org/drawingml/2006/lockedCanvas" xmlns:dgm="http://schemas.openxmlformats.org/drawingml/2006/diagram" xmlns:wps="http://schemas.microsoft.com/office/word/2010/wordprocessingShape" xmlns:wpg="http://schemas.microsoft.com/office/word/2010/wordprocessingGroup" xmlns:w14="http://schemas.microsoft.com/office/word/2010/wordml" xmlns:w15="http://schemas.microsoft.com/office/word/2012/wordml" xmlns:w16="http://schemas.microsoft.com/office/word/2018/wordml" xmlns:w16cex="http://schemas.microsoft.com/office/word/2018/wordml/cex" xmlns:w16cid="http://schemas.microsoft.com/office/word/2016/wordml/cid" xmlns="http://schemas.microsoft.com/office/tasks/2019/documenttasks" xmlns:cr="http://schemas.microsoft.com/office/comments/2020/reactions">
+<w:hdr xmlns:wpc="http://schemas.microsoft.com/office/word/2010/wordprocessingCanvas" xmlns:mc="http://schemas.openxmlformats.org/markup-compatibility/2006" xmlns:o="urn:schemas-microsoft-com:office:office" xmlns:r="http://schemas.openxmlformats.org/officeDocument/2006/relationships" xmlns:m="http://schemas.openxmlformats.org/officeDocument/2006/math" xmlns:v="urn:schemas-microsoft-com:vml" xmlns:wp14="http://schemas.microsoft.com/office/word/2010/wordprocessingDrawing" xmlns:wp="http://schemas.openxmlformats.org/drawingml/2006/wordprocessingDrawing" xmlns:w10="urn:schemas-microsoft-com:office:word" xmlns:w="http://schemas.openxmlformats.org/wordprocessingml/2006/main" xmlns:w14="http://schemas.microsoft.com/office/word/2010/wordml" xmlns:w15="http://schemas.microsoft.com/office/word/2012/wordml" xmlns:w16se="http://schemas.microsoft.com/office/word/2015/wordml/symex" xmlns:w16cid="http://schemas.microsoft.com/office/word/2016/wordml/cid" xmlns:w16="http://schemas.microsoft.com/office/word/2018/wordml" xmlns:w16cex="http://schemas.microsoft.com/office/word/2018/wordml/cex" xmlns:w16sdtdh="http://schemas.microsoft.com/office/word/2020/wordml/sdtdatahash" xmlns:wne="http://schemas.microsoft.com/office/word/2006/wordml" xmlns:wpg="http://schemas.microsoft.com/office/word/2010/wordprocessingGroup" xmlns:wps="http://schemas.microsoft.com/office/word/2010/wordprocessingShape">
   <w:p>
     <w:pPr>
       <w:keepNext w:val="0"/>
       <w:keepLines w:val="0"/>
       <w:pageBreakBefore w:val="0"/>
-      <w:widowControl w:val="1"/>
+      <w:widowControl/>
       <w:pBdr>
-        <w:top w:space="0" w:sz="0" w:val="nil"/>
-        <w:left w:space="0" w:sz="0" w:val="nil"/>
-        <w:bottom w:space="0" w:sz="0" w:val="nil"/>
-        <w:right w:space="0" w:sz="0" w:val="nil"/>
-        <w:between w:space="0" w:sz="0" w:val="nil"/>
+        <w:top w:val="nil"/>
+        <w:left w:val="nil"/>
+        <w:bottom w:val="nil"/>
+        <w:right w:val="nil"/>
+        <w:between w:val="nil"/>
       </w:pBdr>
-      <w:shd w:fill="auto" w:val="clear"/>
+      <w:shd w:val="clear"/>
       <w:tabs>
-        <w:tab w:val="center" w:leader="none" w:pos="4680"/>
-        <w:tab w:val="right" w:leader="none" w:pos="9360"/>
+        <w:tab w:val="center" w:pos="4680"/>
+        <w:tab w:val="right" w:pos="9360"/>
       </w:tabs>
-      <w:spacing w:after="0" w:before="0" w:line="240" w:lineRule="auto"/>
-      <w:ind w:left="0" w:right="0" w:firstLine="0"/>
+      <w:spacing w:before="0" w:after="0" w:line="240" w:lineRule="auto"/>
+      <w:ind w:left="0" w:right="0"/>
       <w:jc w:val="right"/>
       <w:rPr>
-        <w:rFonts w:ascii="Aptos" w:cs="Aptos" w:eastAsia="Aptos" w:hAnsi="Aptos"/>
+        <w:rFonts w:ascii="Aptos" w:hAnsi="Aptos" w:eastAsia="Aptos" w:cs="Aptos"/>
         <w:b w:val="0"/>
         <w:bCs w:val="0"/>
         <w:i w:val="0"/>
@@ -9236,15 +9227,14 @@
         <w:sz w:val="18"/>
         <w:szCs w:val="18"/>
         <w:u w:val="none"/>
-        <w:shd w:fill="auto" w:val="clear"/>
-        <w:vertAlign w:val="baseline"/>
+        <w:shd w:val="clear"/>
       </w:rPr>
     </w:pPr>
     <w:r>
       <w:rPr>
-        <w:rFonts w:ascii="Aptos" w:cs="Aptos" w:eastAsia="Aptos" w:hAnsi="Aptos"/>
-        <w:b w:val="1"/>
-        <w:bCs w:val="1"/>
+        <w:rFonts w:ascii="Aptos" w:hAnsi="Aptos" w:eastAsia="Aptos" w:cs="Aptos"/>
+        <w:b/>
+        <w:bCs/>
         <w:i w:val="0"/>
         <w:iCs w:val="0"/>
         <w:smallCaps w:val="0"/>
@@ -9253,8 +9243,7 @@
         <w:sz w:val="16"/>
         <w:szCs w:val="16"/>
         <w:u w:val="none"/>
-        <w:shd w:fill="auto" w:val="clear"/>
-        <w:vertAlign w:val="baseline"/>
+        <w:shd w:val="clear"/>
         <w:rtl w:val="0"/>
       </w:rPr>
       <w:t xml:space="preserve">BANKING LAB  |  BL-MOB-002</w:t>

</xml_diff>